<commit_message>
HTML/KaTeX decks beside every pptx; word boards ask a real question (Units 3 and 4)
Co-Authored-By: Claude Fable 5.1 <noreply@anthropic.com>
Claude-Session: https://claude.ai/code/session_015xYWeLUsuszQH6z7ADE9tj
</commit_message>
<xml_diff>
--- a/a7/build/out/u3/A7 3.01  Lesson Plan.docx
+++ b/a7/build/out/u3/A7 3.01  Lesson Plan.docx
@@ -4101,7 +4101,7 @@
                 <w:color w:val="1A1A1A"/>
                 <w:sz w:val="18"/>
               </w:rPr>
-              <w:t>A photo is enlarged 2</w:t>
+              <w:t>A rectangle is 2</w:t>
             </w:r>
             <w:r>
               <w:rPr>
@@ -4120,7 +4120,7 @@
                 <w:color w:val="1A1A1A"/>
                 <w:sz w:val="18"/>
               </w:rPr>
-              <w:t xml:space="preserve"> times, then 2</w:t>
+              <w:t xml:space="preserve"> centimeters long and 2</w:t>
             </w:r>
             <w:r>
               <w:rPr>
@@ -4139,83 +4139,7 @@
                 <w:color w:val="1A1A1A"/>
                 <w:sz w:val="18"/>
               </w:rPr>
-              <w:t xml:space="preserve"> times more. In all it is 2</w:t>
-            </w:r>
-            <w:r>
-              <w:rPr>
-                <w:b w:val="0"/>
-                <w:i w:val="0"/>
-                <w:color w:val="1A1A1A"/>
-                <w:sz w:val="18"/>
-                <w:vertAlign w:val="superscript"/>
-              </w:rPr>
-              <w:t>4</w:t>
-            </w:r>
-            <w:r>
-              <w:rPr>
-                <w:b w:val="0"/>
-                <w:i w:val="0"/>
-                <w:color w:val="1A1A1A"/>
-                <w:sz w:val="18"/>
-              </w:rPr>
-              <w:t xml:space="preserve"> · 2</w:t>
-            </w:r>
-            <w:r>
-              <w:rPr>
-                <w:b w:val="0"/>
-                <w:i w:val="0"/>
-                <w:color w:val="1A1A1A"/>
-                <w:sz w:val="18"/>
-                <w:vertAlign w:val="superscript"/>
-              </w:rPr>
-              <w:t>2</w:t>
-            </w:r>
-            <w:r>
-              <w:rPr>
-                <w:b w:val="0"/>
-                <w:i w:val="0"/>
-                <w:color w:val="1A1A1A"/>
-                <w:sz w:val="18"/>
-              </w:rPr>
-              <w:t xml:space="preserve"> times bigger. The photo is 9 cm wide. Write 2</w:t>
-            </w:r>
-            <w:r>
-              <w:rPr>
-                <w:b w:val="0"/>
-                <w:i w:val="0"/>
-                <w:color w:val="1A1A1A"/>
-                <w:sz w:val="18"/>
-                <w:vertAlign w:val="superscript"/>
-              </w:rPr>
-              <w:t>4</w:t>
-            </w:r>
-            <w:r>
-              <w:rPr>
-                <w:b w:val="0"/>
-                <w:i w:val="0"/>
-                <w:color w:val="1A1A1A"/>
-                <w:sz w:val="18"/>
-              </w:rPr>
-              <w:t xml:space="preserve"> · 2</w:t>
-            </w:r>
-            <w:r>
-              <w:rPr>
-                <w:b w:val="0"/>
-                <w:i w:val="0"/>
-                <w:color w:val="1A1A1A"/>
-                <w:sz w:val="18"/>
-                <w:vertAlign w:val="superscript"/>
-              </w:rPr>
-              <w:t>2</w:t>
-            </w:r>
-            <w:r>
-              <w:rPr>
-                <w:b w:val="0"/>
-                <w:i w:val="0"/>
-                <w:color w:val="1A1A1A"/>
-                <w:sz w:val="18"/>
-              </w:rPr>
-              <w:t xml:space="preserve"> as one power. Then find its value.</w:t>
+              <w:t xml:space="preserve"> centimeters wide. Its perimeter is 40 centimeters. What is the area of the rectangle, in square centimeters?</w:t>
             </w:r>
           </w:p>
         </w:tc>
@@ -4265,7 +4189,7 @@
                 <w:color w:val="9E1B32"/>
                 <w:sz w:val="18"/>
               </w:rPr>
-              <w:t xml:space="preserve"> = 64</w:t>
+              <w:t xml:space="preserve"> = 64 square centimeters</w:t>
             </w:r>
           </w:p>
         </w:tc>
@@ -4296,45 +4220,7 @@
                 <w:color w:val="1A1A1A"/>
                 <w:sz w:val="18"/>
               </w:rPr>
-              <w:t>576 — the width was used [the question asks for the value of 2</w:t>
-            </w:r>
-            <w:r>
-              <w:rPr>
-                <w:b w:val="0"/>
-                <w:i w:val="0"/>
-                <w:color w:val="1A1A1A"/>
-                <w:sz w:val="18"/>
-                <w:vertAlign w:val="superscript"/>
-              </w:rPr>
-              <w:t>4</w:t>
-            </w:r>
-            <w:r>
-              <w:rPr>
-                <w:b w:val="0"/>
-                <w:i w:val="0"/>
-                <w:color w:val="1A1A1A"/>
-                <w:sz w:val="18"/>
-              </w:rPr>
-              <w:t xml:space="preserve"> · 2</w:t>
-            </w:r>
-            <w:r>
-              <w:rPr>
-                <w:b w:val="0"/>
-                <w:i w:val="0"/>
-                <w:color w:val="1A1A1A"/>
-                <w:sz w:val="18"/>
-                <w:vertAlign w:val="superscript"/>
-              </w:rPr>
-              <w:t>2</w:t>
-            </w:r>
-            <w:r>
-              <w:rPr>
-                <w:b w:val="0"/>
-                <w:i w:val="0"/>
-                <w:color w:val="1A1A1A"/>
-                <w:sz w:val="18"/>
-              </w:rPr>
-              <w:t>, not a width]; 256 — multiplied the exponents (2</w:t>
+              <w:t>40 — the perimeter was copied as the answer [the unneeded figure was used]; 20 — the sides were added, not multiplied; 256 — the exponents were multiplied (2</w:t>
             </w:r>
             <w:r>
               <w:rPr>
@@ -4353,7 +4239,7 @@
                 <w:color w:val="1A1A1A"/>
                 <w:sz w:val="18"/>
               </w:rPr>
-              <w:t>); 4096 — multiplied the bases (4</w:t>
+              <w:t>) [confused with power of a power]; 4096 — the bases were multiplied (4</w:t>
             </w:r>
             <w:r>
               <w:rPr>

</xml_diff>